<commit_message>
M16: regenerate meridian-actuarial under the wave's knobs (baseline + mail demonstrator)
Wholesale regen through the live airlock (claude-opus-4-8[1m], xhigh).
Baseline realism (business_calendar: 0 weekend meetings, book_is_sample,
style_specs: 12 specs, voice_diversify) plus real mail threads (eml 3->22
above 6 engagements; 4 mundane internal emails with exempt_author_mentions;
1 distribution list). Both hard-case knobs (signature-page fee, filename
date) retained. Validates clean (29 rules, EML/DL run, 0 errors); self-scores
100%; byte-pin re-derives; org-tier green.
</commit_message>
<xml_diff>
--- a/companies/meridian-actuarial/Engagements/Estes Group/2019.02.07 - Kickoff Memo - Experience Study.docx
+++ b/companies/meridian-actuarial/Engagements/Estes Group/2019.02.07 - Kickoff Memo - Experience Study.docx
@@ -2,31 +2,13 @@
 <file path=word/document.xml><?xml version="1.0" encoding="utf-8"?>
 <w:document xmlns:wpc="http://schemas.microsoft.com/office/word/2010/wordprocessingCanvas" xmlns:mo="http://schemas.microsoft.com/office/mac/office/2008/main" xmlns:mc="http://schemas.openxmlformats.org/markup-compatibility/2006" xmlns:mv="urn:schemas-microsoft-com:mac:vml" xmlns:o="urn:schemas-microsoft-com:office:office" xmlns:r="http://schemas.openxmlformats.org/officeDocument/2006/relationships" xmlns:m="http://schemas.openxmlformats.org/officeDocument/2006/math" xmlns:v="urn:schemas-microsoft-com:vml" xmlns:wp14="http://schemas.microsoft.com/office/word/2010/wordprocessingDrawing" xmlns:wp="http://schemas.openxmlformats.org/drawingml/2006/wordprocessingDrawing" xmlns:w10="urn:schemas-microsoft-com:office:word" xmlns:w="http://schemas.openxmlformats.org/wordprocessingml/2006/main" xmlns:w14="http://schemas.microsoft.com/office/word/2010/wordml" xmlns:wpg="http://schemas.microsoft.com/office/word/2010/wordprocessingGroup" xmlns:wpi="http://schemas.microsoft.com/office/word/2010/wordprocessingInk" xmlns:wne="http://schemas.microsoft.com/office/word/2006/wordml" xmlns:wps="http://schemas.microsoft.com/office/word/2010/wordprocessingShape" mc:Ignorable="w14 wp14">
   <w:body>
-    <w:p>
-      <w:pPr>
-        <w:pStyle w:val="Heading1"/>
-      </w:pPr>
-      <w:r>
-        <w:t>Kickoff Memo: Experience Study</w:t>
-      </w:r>
-    </w:p>
     <w:p>
       <w:r>
         <w:t>To: Jeffrey Ochoa, Megan Dudley</w:t>
         <w:br/>
         <w:t>From: David Sherman</w:t>
         <w:br/>
-        <w:t>Re: Estes Group experience study, kickoff</w:t>
-      </w:r>
-    </w:p>
-    <w:p>
-      <w:r>
-        <w:t>The letter is countersigned and we are on the clock as of February 4, 2019. The objective is an experience study of the Estes Group retirement plan: exposures and actual-to-expected ratios for mortality, retirement, withdrawal, and disability, plus the salary increase assumption, over an observation period we settle with the client's staff before we measure anything. Deliverables are a report and an exhibit workbook. Robert reviews and signs. Barbara Hall is the client contact and the only person there who speaks for them on scope.</w:t>
-      </w:r>
-    </w:p>
-    <w:p>
-      <w:r>
-        <w:t>What this is not: it is not a valuation, it is not a restatement of the last valuation on new rates, and it is not a view on the investment return assumption. If any of that gets asked for on a call, the answer is that we will scope it, not that we will take a look.</w:t>
+        <w:t>Re: Estes Group experience study</w:t>
       </w:r>
     </w:p>
     <w:p>
@@ -34,7 +16,35 @@
         <w:pStyle w:val="Heading2"/>
       </w:pPr>
       <w:r>
-        <w:t>Workstreams</w:t>
+        <w:t>What We Are Doing</w:t>
+      </w:r>
+    </w:p>
+    <w:p>
+      <w:r>
+        <w:t>This memo sets the plan for the Estes Group experience study and assigns the work. The goal is a report the board can act on: a review of the plan's recent retirement, termination, disability, mortality, and salary experience against the assumptions now in force, with recommendations where the two diverge. The deliverables are that report and a workbook of exhibits that supports every rate in it. The study is a look-back over the observation period the client confirms, so the first job is to fix that window and the population inside it before any rate is computed.</w:t>
+      </w:r>
+    </w:p>
+    <w:p>
+      <w:r>
+        <w:t>We do this the way we do every study. What the experience shows, what the plan assumes, and what we recommend are three separate things, and they stay separate in the workbook and in the report. If a rate surprises us, we find the reason before it reaches a page. A number we cannot explain is not a finding; it is an open question, and it stays open until it is answered.</w:t>
+      </w:r>
+    </w:p>
+    <w:p>
+      <w:r>
+        <w:t>Barbara Hall, the Chief Operating Officer at Estes Group, is our point of contact. Data requests and scheduling go through her office. Any client-facing question goes through me before it goes to her, so that we speak with one voice on scope and timing.</w:t>
+      </w:r>
+    </w:p>
+    <w:p>
+      <w:pPr>
+        <w:pStyle w:val="Heading2"/>
+      </w:pPr>
+      <w:r>
+        <w:t>Assignments</w:t>
+      </w:r>
+    </w:p>
+    <w:p>
+      <w:r>
+        <w:t>Here is how the work divides:</w:t>
       </w:r>
     </w:p>
     <w:p>
@@ -42,7 +52,7 @@
         <w:pStyle w:val="ListBullet"/>
       </w:pPr>
       <w:r>
-        <w:t>Data. Mine. Participant extracts as of each valuation date in the period, plus the decrement records for the years between. The first job is not building anything, it is proving the extracts are the same population year to year. Often they are not, and a study built on a population that quietly changed shape measures the change and calls it experience. Nobody builds an exposure until the reconciliation is closed.</w:t>
+        <w:t>Data. I will reconstruct the member census and the plan's financial records, reconcile both, and document our reliance. I tie the counts to the prior study and to the client's own summaries, and I flag any gap before anything is tabulated.</w:t>
       </w:r>
     </w:p>
     <w:p>
@@ -50,7 +60,7 @@
         <w:pStyle w:val="ListBullet"/>
       </w:pPr>
       <w:r>
-        <w:t>Plan provisions. Jeffrey Ochoa. Read the document and every amendment in force during the observation period, not only the ones in force now. If a rate moves partway through the period, an amendment is a likelier explanation than behavior, and we need to know which before we recommend anything.</w:t>
+        <w:t>Modeling. Jeffrey Ochoa builds the study model and runs the observed experience against the current assumptions. He sets no result as final until it is reviewed, and he traces any surprising rate back to the data behind it.</w:t>
       </w:r>
     </w:p>
     <w:p>
@@ -58,23 +68,7 @@
         <w:pStyle w:val="ListBullet"/>
       </w:pPr>
       <w:r>
-        <w:t>Exposures and actual-to-expected. Mine, with Megan Dudley. Central exposure by decrement, by age and service, split by gender where the counts support a split. Where they do not, the exhibit says so instead of splitting anyway and presenting two thin halves as though they were results.</w:t>
-      </w:r>
-    </w:p>
-    <w:p>
-      <w:pPr>
-        <w:pStyle w:val="ListBullet"/>
-      </w:pPr>
-      <w:r>
-        <w:t>Exhibits. Megan Dudley. One workbook, one tab per decrement, identical layout on every tab. Nothing hand-keyed. If a number is on an exhibit it traces to the source, and it traces without anyone having to ask her.</w:t>
-      </w:r>
-    </w:p>
-    <w:p>
-      <w:pPr>
-        <w:pStyle w:val="ListBullet"/>
-      </w:pPr>
-      <w:r>
-        <w:t>Report. Jeffrey Ochoa drafts the narrative sections, Megan Dudley drafts the exhibit commentary, I take data and methodology. Robert wants measurement, assumption, and conclusion in separate paragraphs. If they come to him braided together he will send them back, and he will be right to.</w:t>
+        <w:t>Exhibits and checks. Megan Dudley prepares the experience exhibits and the data checks beneath the modeling. She raises anything that does not reconcile rather than carrying it forward, and her questions are welcome the moment she has them.</w:t>
       </w:r>
     </w:p>
     <w:p>
@@ -82,52 +76,25 @@
         <w:pStyle w:val="Heading2"/>
       </w:pPr>
       <w:r>
-        <w:t>Next Steps</w:t>
+        <w:t>What Gates the Work</w:t>
+      </w:r>
+    </w:p>
+    <w:p>
+      <w:r>
+        <w:t>Two things gate the rest. The first is complete member and financial data from Estes Group. The second is a clean confirmation of the plan provisions the current assumptions rest on. Until both are in hand, we tabulate nothing and treat every assumption as provisional. Data quality is the usual risk on a first study for a client; expect the census to need a pass for status codes and for members whose records do not agree with the summary. On the financial side, the contribution and withdrawal history has to distinguish a refunded member from one who left a balance in the fund, because the termination experience turns on that split. We raise anything unclear with Barbara Hall's office early rather than carry it into the model.</w:t>
       </w:r>
     </w:p>
     <w:p>
       <w:pPr>
-        <w:pStyle w:val="ListBullet"/>
+        <w:pStyle w:val="Heading2"/>
       </w:pPr>
       <w:r>
-        <w:t>Data request to Barbara Hall's staff this week, itemized, with the field definitions attached so nobody on their side is guessing at codes.</w:t>
-      </w:r>
-    </w:p>
-    <w:p>
-      <w:pPr>
-        <w:pStyle w:val="ListBullet"/>
-      </w:pPr>
-      <w:r>
-        <w:t>Jeffrey Ochoa pulls the plan document and the full amendment history and flags any gap before we assume the history is complete.</w:t>
-      </w:r>
-    </w:p>
-    <w:p>
-      <w:pPr>
-        <w:pStyle w:val="ListBullet"/>
-      </w:pPr>
-      <w:r>
-        <w:t>Observation period fixed with the client in writing before we build a single exposure. Not agreed on a call and remembered differently later.</w:t>
-      </w:r>
-    </w:p>
-    <w:p>
-      <w:pPr>
-        <w:pStyle w:val="ListBullet"/>
-      </w:pPr>
-      <w:r>
-        <w:t>Megan Dudley builds the workbook shell off the agreed layout now, so the exhibits are not being invented in the last three weeks.</w:t>
-      </w:r>
-    </w:p>
-    <w:p>
-      <w:pPr>
-        <w:pStyle w:val="ListBullet"/>
-      </w:pPr>
-      <w:r>
-        <w:t>No rate leaves this team, in any forum, until the reconciliation is closed and Robert has seen it.</w:t>
+        <w:t>Where We Start</w:t>
       </w:r>
     </w:p>
     <w:p>
       <w:r>
-        <w:t>One more thing. This client has not had a study done in some years, so a few of these rates will move, and one or two may move enough to be uncomfortable. That is the point of doing the work. What we owe them is the number the data support and a clear account of how we got there. Anything either of you cannot reconcile, bring to me early. Early is a data question. Late is a schedule problem.</w:t>
+        <w:t>Work begins on February 4, 2019. The data request goes to Barbara Hall's office that week; it will list the member fields and the financial records we need and the format we want them in. Jeffrey Ochoa drafts the assumption inventory for review before any assumption is treated as settled. Megan Dudley sets up the exhibit shells so that the numbers drop into a form we can check as they arrive. In the first two weeks I expect us to load the census, tie it to the prior study, and open a short list of data questions for the client; I will keep that list on our running thread so nothing waits on a request no one has sent. We hold the study until the data and the plan provisions are both confirmed.</w:t>
       </w:r>
     </w:p>
     <w:sectPr>

</xml_diff>